<commit_message>
feat(main): make course structure
</commit_message>
<xml_diff>
--- a/labs/lab02/report/report.docx
+++ b/labs/lab02/report/report.docx
@@ -111,17 +111,17 @@
         <w:pStyle w:val="FirstParagraph"/>
       </w:pPr>
       <w:r>
-        <w:t xml:space="preserve">Изучить идеологию и применение средств контроля версий.</w:t>
-      </w:r>
-      <w:r>
-        <w:t xml:space="preserve"> </w:t>
-      </w:r>
-      <w:r>
-        <w:t xml:space="preserve">Освоить умения по работе с git.</w:t>
+        <w:t xml:space="preserve">Получить представление о работе с учётными записями пользователей и группами</w:t>
+      </w:r>
+      <w:r>
+        <w:t xml:space="preserve"> </w:t>
+      </w:r>
+      <w:r>
+        <w:t xml:space="preserve">пользователей в операционной системе типа Linux.</w:t>
       </w:r>
     </w:p>
     <w:bookmarkEnd w:id="20"/>
-    <w:bookmarkStart w:id="21" w:name="задание"/>
+    <w:bookmarkStart w:id="39" w:name="выполнение-лабораторной-работы"/>
     <w:p>
       <w:pPr>
         <w:pStyle w:val="Heading1"/>
@@ -136,63 +136,6 @@
         <w:tab/>
       </w:r>
       <w:r>
-        <w:t xml:space="preserve">Задание</w:t>
-      </w:r>
-    </w:p>
-    <w:p>
-      <w:pPr>
-        <w:pStyle w:val="FirstParagraph"/>
-      </w:pPr>
-      <w:r>
-        <w:t xml:space="preserve">Создать базовую конфигурацию для работы с git.</w:t>
-      </w:r>
-      <w:r>
-        <w:t xml:space="preserve"> </w:t>
-      </w:r>
-      <w:r>
-        <w:t xml:space="preserve">Создать ключ SSH.</w:t>
-      </w:r>
-      <w:r>
-        <w:t xml:space="preserve"> </w:t>
-      </w:r>
-      <w:r>
-        <w:t xml:space="preserve">Создать ключ PGP.</w:t>
-      </w:r>
-      <w:r>
-        <w:t xml:space="preserve"> </w:t>
-      </w:r>
-      <w:r>
-        <w:t xml:space="preserve">Настроить подписи git.</w:t>
-      </w:r>
-      <w:r>
-        <w:t xml:space="preserve"> </w:t>
-      </w:r>
-      <w:r>
-        <w:t xml:space="preserve">Зарегистрироваться на Github.</w:t>
-      </w:r>
-      <w:r>
-        <w:t xml:space="preserve"> </w:t>
-      </w:r>
-      <w:r>
-        <w:t xml:space="preserve">Создать локальный каталог для выполнения заданий по предмету.</w:t>
-      </w:r>
-    </w:p>
-    <w:bookmarkEnd w:id="21"/>
-    <w:bookmarkStart w:id="55" w:name="выполнение-лабораторной-работы"/>
-    <w:p>
-      <w:pPr>
-        <w:pStyle w:val="Heading1"/>
-      </w:pPr>
-      <w:r>
-        <w:rPr>
-          <w:rStyle w:val="SectionNumber"/>
-        </w:rPr>
-        <w:t xml:space="preserve">3</w:t>
-      </w:r>
-      <w:r>
-        <w:tab/>
-      </w:r>
-      <w:r>
         <w:t xml:space="preserve">Выполнение лабораторной работы</w:t>
       </w:r>
     </w:p>
@@ -205,7 +148,37 @@
         </w:numPr>
       </w:pPr>
       <w:r>
-        <w:t xml:space="preserve">Установка git и gh (рис. 1)</w:t>
+        <w:t xml:space="preserve">Войдите в систему как обычный пользователь и откройте терминал.</w:t>
+      </w:r>
+      <w:r>
+        <w:t xml:space="preserve"> </w:t>
+      </w:r>
+      <w:r>
+        <w:t xml:space="preserve">Определите, какую учётную запись пользователя вы используете.</w:t>
+      </w:r>
+      <w:r>
+        <w:t xml:space="preserve"> </w:t>
+      </w:r>
+      <w:r>
+        <w:t xml:space="preserve">Выведите на экран более подробную информацию. Используйте команду su для переключения к учётной записи root. При запросе</w:t>
+      </w:r>
+      <w:r>
+        <w:t xml:space="preserve"> </w:t>
+      </w:r>
+      <w:r>
+        <w:t xml:space="preserve">пароля введите пароль пользователя root.</w:t>
+      </w:r>
+      <w:r>
+        <w:t xml:space="preserve"> </w:t>
+      </w:r>
+      <w:r>
+        <w:t xml:space="preserve">Вернитесь к учётной записи своего пользователя.</w:t>
+      </w:r>
+      <w:r>
+        <w:t xml:space="preserve"> </w:t>
+      </w:r>
+      <w:r>
+        <w:t xml:space="preserve">Просмотрите в безопасном режиме файл /etc/sudoers (рис. 1)</w:t>
       </w:r>
     </w:p>
     <w:p>
@@ -215,20 +188,20 @@
       <w:r>
         <w:drawing>
           <wp:inline>
-            <wp:extent cx="3733800" cy="2396695"/>
+            <wp:extent cx="3733800" cy="2675890"/>
             <wp:effectExtent b="0" l="0" r="0" t="0"/>
-            <wp:docPr descr="Устанавливаем git, gh" title="" id="23" name="Picture"/>
+            <wp:docPr descr="Выполняем команды" title="" id="22" name="Picture"/>
             <a:graphic>
               <a:graphicData uri="http://schemas.openxmlformats.org/drawingml/2006/picture">
                 <pic:pic>
                   <pic:nvPicPr>
-                    <pic:cNvPr descr="image/1.png" id="24" name="Picture"/>
+                    <pic:cNvPr descr="image/1.png" id="23" name="Picture"/>
                     <pic:cNvPicPr>
                       <a:picLocks noChangeArrowheads="1" noChangeAspect="1"/>
                     </pic:cNvPicPr>
                   </pic:nvPicPr>
                   <pic:blipFill>
-                    <a:blip r:embed="rId22"/>
+                    <a:blip r:embed="rId21"/>
                     <a:stretch>
                       <a:fillRect/>
                     </a:stretch>
@@ -236,7 +209,7 @@
                   <pic:spPr bwMode="auto">
                     <a:xfrm>
                       <a:off x="0" y="0"/>
-                      <a:ext cx="3733800" cy="2396695"/>
+                      <a:ext cx="3733800" cy="2675890"/>
                     </a:xfrm>
                     <a:prstGeom prst="rect">
                       <a:avLst/>
@@ -260,7 +233,7 @@
         <w:pStyle w:val="ImageCaption"/>
       </w:pPr>
       <w:r>
-        <w:t xml:space="preserve">Рис. 1: Устанавливаем git, gh</w:t>
+        <w:t xml:space="preserve">Рис. 1: Выполняем команды</w:t>
       </w:r>
     </w:p>
     <w:p>
@@ -272,7 +245,37 @@
         </w:numPr>
       </w:pPr>
       <w:r>
-        <w:t xml:space="preserve">Зададим имя и email владельца репозитория и настроим utf-8 в выводе сообщений git (рис. 2)</w:t>
+        <w:t xml:space="preserve">Убедитесь, что в открытом с помощью visudo файле присутствует строка</w:t>
+      </w:r>
+      <w:r>
+        <w:t xml:space="preserve"> </w:t>
+      </w:r>
+      <w:r>
+        <w:t xml:space="preserve">%wheel ALL=(ALL) ALL</w:t>
+      </w:r>
+      <w:r>
+        <w:t xml:space="preserve"> </w:t>
+      </w:r>
+      <w:r>
+        <w:t xml:space="preserve">Создайте пользователя alice, входящего в группу wheel. Убедитесь, что пользователь alice добавлен в группу wheel.</w:t>
+      </w:r>
+      <w:r>
+        <w:t xml:space="preserve"> </w:t>
+      </w:r>
+      <w:r>
+        <w:t xml:space="preserve">Задайте пароль для пользователя alice. Переключитесь на учётную запись пользователя alice. Создайте пользователя bob.</w:t>
+      </w:r>
+      <w:r>
+        <w:t xml:space="preserve"> </w:t>
+      </w:r>
+      <w:r>
+        <w:t xml:space="preserve">Введите пароль при запросе. Проверьте, что пользователь bob создан.</w:t>
+      </w:r>
+      <w:r>
+        <w:t xml:space="preserve"> </w:t>
+      </w:r>
+      <w:r>
+        <w:t xml:space="preserve">Установите пароль для пользователя bob (рис. 2)</w:t>
       </w:r>
     </w:p>
     <w:p>
@@ -282,20 +285,20 @@
       <w:r>
         <w:drawing>
           <wp:inline>
-            <wp:extent cx="3733800" cy="1587029"/>
+            <wp:extent cx="3733800" cy="3754203"/>
             <wp:effectExtent b="0" l="0" r="0" t="0"/>
-            <wp:docPr descr="Базовая настройка git" title="" id="26" name="Picture"/>
+            <wp:docPr descr="Работаем с alice и bob" title="" id="25" name="Picture"/>
             <a:graphic>
               <a:graphicData uri="http://schemas.openxmlformats.org/drawingml/2006/picture">
                 <pic:pic>
                   <pic:nvPicPr>
-                    <pic:cNvPr descr="image/2.png" id="27" name="Picture"/>
+                    <pic:cNvPr descr="image/2.png" id="26" name="Picture"/>
                     <pic:cNvPicPr>
                       <a:picLocks noChangeArrowheads="1" noChangeAspect="1"/>
                     </pic:cNvPicPr>
                   </pic:nvPicPr>
                   <pic:blipFill>
-                    <a:blip r:embed="rId25"/>
+                    <a:blip r:embed="rId24"/>
                     <a:stretch>
                       <a:fillRect/>
                     </a:stretch>
@@ -303,7 +306,7 @@
                   <pic:spPr bwMode="auto">
                     <a:xfrm>
                       <a:off x="0" y="0"/>
-                      <a:ext cx="3733800" cy="1587029"/>
+                      <a:ext cx="3733800" cy="3754203"/>
                     </a:xfrm>
                     <a:prstGeom prst="rect">
                       <a:avLst/>
@@ -327,15 +330,67 @@
         <w:pStyle w:val="ImageCaption"/>
       </w:pPr>
       <w:r>
-        <w:t xml:space="preserve">Рис. 2: Базовая настройка git</w:t>
-      </w:r>
-    </w:p>
-    <w:p>
-      <w:pPr>
-        <w:pStyle w:val="BodyText"/>
-      </w:pPr>
-      <w:r>
-        <w:t xml:space="preserve">Зададим имя начальной ветки(рис. 3)</w:t>
+        <w:t xml:space="preserve">Рис. 2: Работаем с alice и bob</w:t>
+      </w:r>
+    </w:p>
+    <w:p>
+      <w:pPr>
+        <w:pStyle w:val="Compact"/>
+        <w:numPr>
+          <w:ilvl w:val="0"/>
+          <w:numId w:val="1003"/>
+        </w:numPr>
+      </w:pPr>
+      <w:r>
+        <w:t xml:space="preserve">Создание учётных записей пользователей.</w:t>
+      </w:r>
+      <w:r>
+        <w:t xml:space="preserve"> </w:t>
+      </w:r>
+      <w:r>
+        <w:t xml:space="preserve">Переключитесь в терминале на учётную запись пользователя root. Откройте файл конфигурации /etc/login.defs для редактирования. Перейдите в каталог /etc/skel.</w:t>
+      </w:r>
+      <w:r>
+        <w:t xml:space="preserve"> </w:t>
+      </w:r>
+      <w:r>
+        <w:t xml:space="preserve">Создайте каталоги Pictures и Documents.</w:t>
+      </w:r>
+      <w:r>
+        <w:t xml:space="preserve"> </w:t>
+      </w:r>
+      <w:r>
+        <w:t xml:space="preserve">Измените содержимое файла .bashrc, добавив строку</w:t>
+      </w:r>
+      <w:r>
+        <w:t xml:space="preserve"> </w:t>
+      </w:r>
+      <w:r>
+        <w:t xml:space="preserve">export EDITOR=/usr/bin/vim</w:t>
+      </w:r>
+      <w:r>
+        <w:t xml:space="preserve"> </w:t>
+      </w:r>
+      <w:r>
+        <w:t xml:space="preserve">или</w:t>
+      </w:r>
+      <w:r>
+        <w:t xml:space="preserve"> </w:t>
+      </w:r>
+      <w:r>
+        <w:t xml:space="preserve">export EDITOR=/usr/bin/mceditor</w:t>
+      </w:r>
+      <w:r>
+        <w:t xml:space="preserve"> </w:t>
+      </w:r>
+      <w:r>
+        <w:t xml:space="preserve">Переключитесь в терминале на учётную запись пользователя alice. Используя утилиту useradd, создайте пользователя carol.</w:t>
+      </w:r>
+      <w:r>
+        <w:t xml:space="preserve"> </w:t>
+      </w:r>
+      <w:r>
+        <w:t xml:space="preserve">Установите пароль для пользователя carol (рис. 3)</w:t>
       </w:r>
     </w:p>
     <w:p>
@@ -345,20 +400,20 @@
       <w:r>
         <w:drawing>
           <wp:inline>
-            <wp:extent cx="3733800" cy="1349808"/>
+            <wp:extent cx="3733800" cy="3216175"/>
             <wp:effectExtent b="0" l="0" r="0" t="0"/>
-            <wp:docPr descr="Настроим верификацию и подписание коммитов git" title="" id="29" name="Picture"/>
+            <wp:docPr descr="Работаем с carol" title="" id="28" name="Picture"/>
             <a:graphic>
               <a:graphicData uri="http://schemas.openxmlformats.org/drawingml/2006/picture">
                 <pic:pic>
                   <pic:nvPicPr>
-                    <pic:cNvPr descr="image/3.png" id="30" name="Picture"/>
+                    <pic:cNvPr descr="image/3.png" id="29" name="Picture"/>
                     <pic:cNvPicPr>
                       <a:picLocks noChangeArrowheads="1" noChangeAspect="1"/>
                     </pic:cNvPicPr>
                   </pic:nvPicPr>
                   <pic:blipFill>
-                    <a:blip r:embed="rId28"/>
+                    <a:blip r:embed="rId27"/>
                     <a:stretch>
                       <a:fillRect/>
                     </a:stretch>
@@ -366,7 +421,7 @@
                   <pic:spPr bwMode="auto">
                     <a:xfrm>
                       <a:off x="0" y="0"/>
-                      <a:ext cx="3733800" cy="1349808"/>
+                      <a:ext cx="3733800" cy="3216175"/>
                     </a:xfrm>
                     <a:prstGeom prst="rect">
                       <a:avLst/>
@@ -390,7 +445,7 @@
         <w:pStyle w:val="ImageCaption"/>
       </w:pPr>
       <w:r>
-        <w:t xml:space="preserve">Рис. 3: Настроим верификацию и подписание коммитов git</w:t>
+        <w:t xml:space="preserve">Рис. 3: Работаем с carol</w:t>
       </w:r>
     </w:p>
     <w:p>
@@ -398,11 +453,29 @@
         <w:pStyle w:val="Compact"/>
         <w:numPr>
           <w:ilvl w:val="0"/>
-          <w:numId w:val="1003"/>
-        </w:numPr>
-      </w:pPr>
-      <w:r>
-        <w:t xml:space="preserve">Создаем ssh ключи(рис. 4)</w:t>
+          <w:numId w:val="1004"/>
+        </w:numPr>
+      </w:pPr>
+      <w:r>
+        <w:t xml:space="preserve">Посмотрите и прокомментируйте информацию о пользователе carol, проверьте,</w:t>
+      </w:r>
+      <w:r>
+        <w:t xml:space="preserve"> </w:t>
+      </w:r>
+      <w:r>
+        <w:t xml:space="preserve">в какую первоначальную группу входит пользователь carol; также убедитесь, что</w:t>
+      </w:r>
+      <w:r>
+        <w:t xml:space="preserve"> </w:t>
+      </w:r>
+      <w:r>
+        <w:t xml:space="preserve">каталоги Pictures и Documents были созданы в домашнем каталоге пользователя</w:t>
+      </w:r>
+      <w:r>
+        <w:t xml:space="preserve"> </w:t>
+      </w:r>
+      <w:r>
+        <w:t xml:space="preserve">carol. Переключитесь в терминале на учётную запись пользователя alice(рис. 4)</w:t>
       </w:r>
     </w:p>
     <w:p>
@@ -412,20 +485,20 @@
       <w:r>
         <w:drawing>
           <wp:inline>
-            <wp:extent cx="3733800" cy="4670644"/>
+            <wp:extent cx="3733800" cy="3460761"/>
             <wp:effectExtent b="0" l="0" r="0" t="0"/>
-            <wp:docPr descr="Генерируем rsa и ed25519" title="" id="32" name="Picture"/>
+            <wp:docPr descr="Проверяем информацию" title="" id="31" name="Picture"/>
             <a:graphic>
               <a:graphicData uri="http://schemas.openxmlformats.org/drawingml/2006/picture">
                 <pic:pic>
                   <pic:nvPicPr>
-                    <pic:cNvPr descr="image/4.png" id="33" name="Picture"/>
+                    <pic:cNvPr descr="image/4.png" id="32" name="Picture"/>
                     <pic:cNvPicPr>
                       <a:picLocks noChangeArrowheads="1" noChangeAspect="1"/>
                     </pic:cNvPicPr>
                   </pic:nvPicPr>
                   <pic:blipFill>
-                    <a:blip r:embed="rId31"/>
+                    <a:blip r:embed="rId30"/>
                     <a:stretch>
                       <a:fillRect/>
                     </a:stretch>
@@ -433,7 +506,7 @@
                   <pic:spPr bwMode="auto">
                     <a:xfrm>
                       <a:off x="0" y="0"/>
-                      <a:ext cx="3733800" cy="4670644"/>
+                      <a:ext cx="3733800" cy="3460761"/>
                     </a:xfrm>
                     <a:prstGeom prst="rect">
                       <a:avLst/>
@@ -457,7 +530,7 @@
         <w:pStyle w:val="ImageCaption"/>
       </w:pPr>
       <w:r>
-        <w:t xml:space="preserve">Рис. 4: Генерируем rsa и ed25519</w:t>
+        <w:t xml:space="preserve">Рис. 4: Проверяем информацию</w:t>
       </w:r>
     </w:p>
     <w:p>
@@ -465,11 +538,47 @@
         <w:pStyle w:val="Compact"/>
         <w:numPr>
           <w:ilvl w:val="0"/>
-          <w:numId w:val="1004"/>
-        </w:numPr>
-      </w:pPr>
-      <w:r>
-        <w:t xml:space="preserve">Генерируем ключ pgp(рис. 5)</w:t>
+          <w:numId w:val="1005"/>
+        </w:numPr>
+      </w:pPr>
+      <w:r>
+        <w:t xml:space="preserve">Поясните в отчёте строку записи о пароле пользователя carol в файле. Измените свойства пароля пользователя carol следующим образом.</w:t>
+      </w:r>
+      <w:r>
+        <w:t xml:space="preserve"> </w:t>
+      </w:r>
+      <w:r>
+        <w:t xml:space="preserve">В этой записи срок действия пароля истекает через 90 дней (-x 90). За три дня до</w:t>
+      </w:r>
+      <w:r>
+        <w:t xml:space="preserve"> </w:t>
+      </w:r>
+      <w:r>
+        <w:t xml:space="preserve">истечения срока действия пользователь получит предупреждение (-w 3). Пароль дол-</w:t>
+      </w:r>
+      <w:r>
+        <w:t xml:space="preserve"> </w:t>
+      </w:r>
+      <w:r>
+        <w:t xml:space="preserve">жен использоваться как минимум за 30 дней (-n 30) до того, как его можно будет</w:t>
+      </w:r>
+      <w:r>
+        <w:t xml:space="preserve"> </w:t>
+      </w:r>
+      <w:r>
+        <w:t xml:space="preserve">изменить.</w:t>
+      </w:r>
+      <w:r>
+        <w:t xml:space="preserve"> </w:t>
+      </w:r>
+      <w:r>
+        <w:t xml:space="preserve">Убедитесь в изменении в строке с данными о пароле пользователя carol в файле</w:t>
+      </w:r>
+      <w:r>
+        <w:t xml:space="preserve"> </w:t>
+      </w:r>
+      <w:r>
+        <w:t xml:space="preserve">/etc/shadow. Убедитесь, что идентификатор alice существует во всех трёх файлах. Убедитесь, что идентификатор carol существует не во всех трёх файлах (рис. 5)</w:t>
       </w:r>
     </w:p>
     <w:p>
@@ -479,20 +588,20 @@
       <w:r>
         <w:drawing>
           <wp:inline>
-            <wp:extent cx="3733800" cy="4643661"/>
+            <wp:extent cx="3733800" cy="3781321"/>
             <wp:effectExtent b="0" l="0" r="0" t="0"/>
-            <wp:docPr descr="Создаем ключи" title="" id="35" name="Picture"/>
+            <wp:docPr descr="Проверяем информацию" title="" id="34" name="Picture"/>
             <a:graphic>
               <a:graphicData uri="http://schemas.openxmlformats.org/drawingml/2006/picture">
                 <pic:pic>
                   <pic:nvPicPr>
-                    <pic:cNvPr descr="image/5.png" id="36" name="Picture"/>
+                    <pic:cNvPr descr="image/5.png" id="35" name="Picture"/>
                     <pic:cNvPicPr>
                       <a:picLocks noChangeArrowheads="1" noChangeAspect="1"/>
                     </pic:cNvPicPr>
                   </pic:nvPicPr>
                   <pic:blipFill>
-                    <a:blip r:embed="rId34"/>
+                    <a:blip r:embed="rId33"/>
                     <a:stretch>
                       <a:fillRect/>
                     </a:stretch>
@@ -500,7 +609,7 @@
                   <pic:spPr bwMode="auto">
                     <a:xfrm>
                       <a:off x="0" y="0"/>
-                      <a:ext cx="3733800" cy="4643661"/>
+                      <a:ext cx="3733800" cy="3781321"/>
                     </a:xfrm>
                     <a:prstGeom prst="rect">
                       <a:avLst/>
@@ -524,7 +633,7 @@
         <w:pStyle w:val="ImageCaption"/>
       </w:pPr>
       <w:r>
-        <w:t xml:space="preserve">Рис. 5: Создаем ключи</w:t>
+        <w:t xml:space="preserve">Рис. 5: Проверяем информацию</w:t>
       </w:r>
     </w:p>
     <w:p>
@@ -532,19 +641,35 @@
         <w:pStyle w:val="Compact"/>
         <w:numPr>
           <w:ilvl w:val="0"/>
-          <w:numId w:val="1005"/>
-        </w:numPr>
-      </w:pPr>
-      <w:r>
-        <w:t xml:space="preserve">Добавление pgp ключа в github</w:t>
-      </w:r>
-    </w:p>
-    <w:p>
-      <w:pPr>
-        <w:pStyle w:val="FirstParagraph"/>
-      </w:pPr>
-      <w:r>
-        <w:t xml:space="preserve">Выводим список ключей и копируем отпечаток приватного ключа(рис. 6)</w:t>
+          <w:numId w:val="1006"/>
+        </w:numPr>
+      </w:pPr>
+      <w:r>
+        <w:t xml:space="preserve">Работа с группами</w:t>
+      </w:r>
+      <w:r>
+        <w:t xml:space="preserve"> </w:t>
+      </w:r>
+      <w:r>
+        <w:t xml:space="preserve">Находясь под учётной записью пользователя alice, создайте группы main и third. Используйте usermod для добавления пользователей alice и bob в группу main,</w:t>
+      </w:r>
+      <w:r>
+        <w:t xml:space="preserve"> </w:t>
+      </w:r>
+      <w:r>
+        <w:t xml:space="preserve">а carol, dan, dave и david — в группу third. Убедитесь, что пользователь carol правильно добавлен в группу third.</w:t>
+      </w:r>
+      <w:r>
+        <w:t xml:space="preserve"> </w:t>
+      </w:r>
+      <w:r>
+        <w:t xml:space="preserve">Пользователю carol должна быть назначена основная группа с идентификатором</w:t>
+      </w:r>
+      <w:r>
+        <w:t xml:space="preserve"> </w:t>
+      </w:r>
+      <w:r>
+        <w:t xml:space="preserve">gid = 100 (users). Определите, в какие вторичные группы входит carol(рис. 6)</w:t>
       </w:r>
     </w:p>
     <w:p>
@@ -554,20 +679,20 @@
       <w:r>
         <w:drawing>
           <wp:inline>
-            <wp:extent cx="3733800" cy="3972402"/>
+            <wp:extent cx="3733800" cy="1434529"/>
             <wp:effectExtent b="0" l="0" r="0" t="0"/>
-            <wp:docPr descr="Добавляем ключ" title="" id="38" name="Picture"/>
+            <wp:docPr descr="Смотрим информацию" title="" id="37" name="Picture"/>
             <a:graphic>
               <a:graphicData uri="http://schemas.openxmlformats.org/drawingml/2006/picture">
                 <pic:pic>
                   <pic:nvPicPr>
-                    <pic:cNvPr descr="image/6.png" id="39" name="Picture"/>
+                    <pic:cNvPr descr="image/6.png" id="38" name="Picture"/>
                     <pic:cNvPicPr>
                       <a:picLocks noChangeArrowheads="1" noChangeAspect="1"/>
                     </pic:cNvPicPr>
                   </pic:nvPicPr>
                   <pic:blipFill>
-                    <a:blip r:embed="rId37"/>
+                    <a:blip r:embed="rId36"/>
                     <a:stretch>
                       <a:fillRect/>
                     </a:stretch>
@@ -575,7 +700,7 @@
                   <pic:spPr bwMode="auto">
                     <a:xfrm>
                       <a:off x="0" y="0"/>
-                      <a:ext cx="3733800" cy="3972402"/>
+                      <a:ext cx="3733800" cy="1434529"/>
                     </a:xfrm>
                     <a:prstGeom prst="rect">
                       <a:avLst/>
@@ -599,74 +724,26 @@
         <w:pStyle w:val="ImageCaption"/>
       </w:pPr>
       <w:r>
-        <w:t xml:space="preserve">Рис. 6: Добавляем ключ</w:t>
-      </w:r>
-    </w:p>
-    <w:p>
-      <w:pPr>
-        <w:pStyle w:val="Compact"/>
-        <w:numPr>
-          <w:ilvl w:val="0"/>
-          <w:numId w:val="1006"/>
-        </w:numPr>
-      </w:pPr>
-      <w:r>
-        <w:t xml:space="preserve">Настройка автоматических подписей коммитов git (рис. 7)</w:t>
-      </w:r>
-    </w:p>
-    <w:p>
-      <w:pPr>
-        <w:pStyle w:val="CaptionedFigure"/>
-      </w:pPr>
-      <w:r>
-        <w:drawing>
-          <wp:inline>
-            <wp:extent cx="3733800" cy="1866900"/>
-            <wp:effectExtent b="0" l="0" r="0" t="0"/>
-            <wp:docPr descr="Используя введёный email, укажите Git применять его при подписи коммитов" title="" id="41" name="Picture"/>
-            <a:graphic>
-              <a:graphicData uri="http://schemas.openxmlformats.org/drawingml/2006/picture">
-                <pic:pic>
-                  <pic:nvPicPr>
-                    <pic:cNvPr descr="image/7.png" id="42" name="Picture"/>
-                    <pic:cNvPicPr>
-                      <a:picLocks noChangeArrowheads="1" noChangeAspect="1"/>
-                    </pic:cNvPicPr>
-                  </pic:nvPicPr>
-                  <pic:blipFill>
-                    <a:blip r:embed="rId40"/>
-                    <a:stretch>
-                      <a:fillRect/>
-                    </a:stretch>
-                  </pic:blipFill>
-                  <pic:spPr bwMode="auto">
-                    <a:xfrm>
-                      <a:off x="0" y="0"/>
-                      <a:ext cx="3733800" cy="1866900"/>
-                    </a:xfrm>
-                    <a:prstGeom prst="rect">
-                      <a:avLst/>
-                    </a:prstGeom>
-                    <a:noFill/>
-                    <a:ln w="9525">
-                      <a:noFill/>
-                      <a:headEnd/>
-                      <a:tailEnd/>
-                    </a:ln>
-                  </pic:spPr>
-                </pic:pic>
-              </a:graphicData>
-            </a:graphic>
-          </wp:inline>
-        </w:drawing>
-      </w:r>
-    </w:p>
-    <w:p>
-      <w:pPr>
-        <w:pStyle w:val="ImageCaption"/>
-      </w:pPr>
-      <w:r>
-        <w:t xml:space="preserve">Рис. 7: Используя введёный email, укажите Git применять его при подписи коммитов</w:t>
+        <w:t xml:space="preserve">Рис. 6: Смотрим информацию</w:t>
+      </w:r>
+    </w:p>
+    <w:bookmarkEnd w:id="39"/>
+    <w:bookmarkStart w:id="40" w:name="ответы-на-контрольные-вопросы"/>
+    <w:p>
+      <w:pPr>
+        <w:pStyle w:val="Heading1"/>
+      </w:pPr>
+      <w:r>
+        <w:rPr>
+          <w:rStyle w:val="SectionNumber"/>
+        </w:rPr>
+        <w:t xml:space="preserve">3</w:t>
+      </w:r>
+      <w:r>
+        <w:tab/>
+      </w:r>
+      <w:r>
+        <w:t xml:space="preserve">Ответы на контрольные вопросы</w:t>
       </w:r>
     </w:p>
     <w:p>
@@ -678,62 +755,7 @@
         </w:numPr>
       </w:pPr>
       <w:r>
-        <w:t xml:space="preserve">Настройка gh(рис. 8)</w:t>
-      </w:r>
-    </w:p>
-    <w:p>
-      <w:pPr>
-        <w:pStyle w:val="CaptionedFigure"/>
-      </w:pPr>
-      <w:r>
-        <w:drawing>
-          <wp:inline>
-            <wp:extent cx="3733800" cy="2014237"/>
-            <wp:effectExtent b="0" l="0" r="0" t="0"/>
-            <wp:docPr descr="Авторизируемся через браузер" title="" id="44" name="Picture"/>
-            <a:graphic>
-              <a:graphicData uri="http://schemas.openxmlformats.org/drawingml/2006/picture">
-                <pic:pic>
-                  <pic:nvPicPr>
-                    <pic:cNvPr descr="image/8.png" id="45" name="Picture"/>
-                    <pic:cNvPicPr>
-                      <a:picLocks noChangeArrowheads="1" noChangeAspect="1"/>
-                    </pic:cNvPicPr>
-                  </pic:nvPicPr>
-                  <pic:blipFill>
-                    <a:blip r:embed="rId43"/>
-                    <a:stretch>
-                      <a:fillRect/>
-                    </a:stretch>
-                  </pic:blipFill>
-                  <pic:spPr bwMode="auto">
-                    <a:xfrm>
-                      <a:off x="0" y="0"/>
-                      <a:ext cx="3733800" cy="2014237"/>
-                    </a:xfrm>
-                    <a:prstGeom prst="rect">
-                      <a:avLst/>
-                    </a:prstGeom>
-                    <a:noFill/>
-                    <a:ln w="9525">
-                      <a:noFill/>
-                      <a:headEnd/>
-                      <a:tailEnd/>
-                    </a:ln>
-                  </pic:spPr>
-                </pic:pic>
-              </a:graphicData>
-            </a:graphic>
-          </wp:inline>
-        </w:drawing>
-      </w:r>
-    </w:p>
-    <w:p>
-      <w:pPr>
-        <w:pStyle w:val="ImageCaption"/>
-      </w:pPr>
-      <w:r>
-        <w:t xml:space="preserve">Рис. 8: Авторизируемся через браузер</w:t>
+        <w:t xml:space="preserve">Информация о UID и группах</w:t>
       </w:r>
     </w:p>
     <w:p>
@@ -745,62 +767,19 @@
         </w:numPr>
       </w:pPr>
       <w:r>
-        <w:t xml:space="preserve">Создание репозитория курса на основе шаблона(рис. 9)</w:t>
-      </w:r>
-    </w:p>
-    <w:p>
-      <w:pPr>
-        <w:pStyle w:val="CaptionedFigure"/>
-      </w:pPr>
-      <w:r>
-        <w:drawing>
-          <wp:inline>
-            <wp:extent cx="3733800" cy="3659663"/>
-            <wp:effectExtent b="0" l="0" r="0" t="0"/>
-            <wp:docPr descr="Создаем шаблон" title="" id="47" name="Picture"/>
-            <a:graphic>
-              <a:graphicData uri="http://schemas.openxmlformats.org/drawingml/2006/picture">
-                <pic:pic>
-                  <pic:nvPicPr>
-                    <pic:cNvPr descr="image/9.png" id="48" name="Picture"/>
-                    <pic:cNvPicPr>
-                      <a:picLocks noChangeArrowheads="1" noChangeAspect="1"/>
-                    </pic:cNvPicPr>
-                  </pic:nvPicPr>
-                  <pic:blipFill>
-                    <a:blip r:embed="rId46"/>
-                    <a:stretch>
-                      <a:fillRect/>
-                    </a:stretch>
-                  </pic:blipFill>
-                  <pic:spPr bwMode="auto">
-                    <a:xfrm>
-                      <a:off x="0" y="0"/>
-                      <a:ext cx="3733800" cy="3659663"/>
-                    </a:xfrm>
-                    <a:prstGeom prst="rect">
-                      <a:avLst/>
-                    </a:prstGeom>
-                    <a:noFill/>
-                    <a:ln w="9525">
-                      <a:noFill/>
-                      <a:headEnd/>
-                      <a:tailEnd/>
-                    </a:ln>
-                  </pic:spPr>
-                </pic:pic>
-              </a:graphicData>
-            </a:graphic>
-          </wp:inline>
-        </w:drawing>
-      </w:r>
-    </w:p>
-    <w:p>
-      <w:pPr>
-        <w:pStyle w:val="ImageCaption"/>
-      </w:pPr>
-      <w:r>
-        <w:t xml:space="preserve">Рис. 9: Создаем шаблон</w:t>
+        <w:t xml:space="preserve">UID и GID: id [user] или просто id (для текущего пользователя)</w:t>
+      </w:r>
+    </w:p>
+    <w:p>
+      <w:pPr>
+        <w:pStyle w:val="Compact"/>
+        <w:numPr>
+          <w:ilvl w:val="0"/>
+          <w:numId w:val="1008"/>
+        </w:numPr>
+      </w:pPr>
+      <w:r>
+        <w:t xml:space="preserve">Список групп: groups [user] или id -Gn [user]</w:t>
       </w:r>
     </w:p>
     <w:p>
@@ -812,129 +791,424 @@
         </w:numPr>
       </w:pPr>
       <w:r>
-        <w:t xml:space="preserve">Настройка каталога курса(рис. 10)</w:t>
-      </w:r>
-    </w:p>
-    <w:p>
-      <w:pPr>
-        <w:pStyle w:val="CaptionedFigure"/>
-      </w:pPr>
-      <w:r>
-        <w:drawing>
-          <wp:inline>
-            <wp:extent cx="3733800" cy="1393653"/>
-            <wp:effectExtent b="0" l="0" r="0" t="0"/>
-            <wp:docPr descr="Удаляем лишние файла и создаем каталоги" title="" id="50" name="Picture"/>
-            <a:graphic>
-              <a:graphicData uri="http://schemas.openxmlformats.org/drawingml/2006/picture">
-                <pic:pic>
-                  <pic:nvPicPr>
-                    <pic:cNvPr descr="image/10.png" id="51" name="Picture"/>
-                    <pic:cNvPicPr>
-                      <a:picLocks noChangeArrowheads="1" noChangeAspect="1"/>
-                    </pic:cNvPicPr>
-                  </pic:nvPicPr>
-                  <pic:blipFill>
-                    <a:blip r:embed="rId49"/>
-                    <a:stretch>
-                      <a:fillRect/>
-                    </a:stretch>
-                  </pic:blipFill>
-                  <pic:spPr bwMode="auto">
-                    <a:xfrm>
-                      <a:off x="0" y="0"/>
-                      <a:ext cx="3733800" cy="1393653"/>
-                    </a:xfrm>
-                    <a:prstGeom prst="rect">
-                      <a:avLst/>
-                    </a:prstGeom>
-                    <a:noFill/>
-                    <a:ln w="9525">
-                      <a:noFill/>
-                      <a:headEnd/>
-                      <a:tailEnd/>
-                    </a:ln>
-                  </pic:spPr>
-                </pic:pic>
-              </a:graphicData>
-            </a:graphic>
-          </wp:inline>
-        </w:drawing>
-      </w:r>
-    </w:p>
-    <w:p>
-      <w:pPr>
-        <w:pStyle w:val="ImageCaption"/>
-      </w:pPr>
-      <w:r>
-        <w:t xml:space="preserve">Рис. 10: Удаляем лишние файла и создаем каталоги</w:t>
-      </w:r>
-    </w:p>
-    <w:p>
-      <w:pPr>
-        <w:pStyle w:val="BodyText"/>
-      </w:pPr>
-      <w:r>
-        <w:t xml:space="preserve">Отправьте файлы на сервер(рис. 11)</w:t>
-      </w:r>
-    </w:p>
-    <w:p>
-      <w:pPr>
-        <w:pStyle w:val="CaptionedFigure"/>
-      </w:pPr>
-      <w:r>
-        <w:drawing>
-          <wp:inline>
-            <wp:extent cx="3733800" cy="1161789"/>
-            <wp:effectExtent b="0" l="0" r="0" t="0"/>
-            <wp:docPr descr="Отправка файлов" title="" id="53" name="Picture"/>
-            <a:graphic>
-              <a:graphicData uri="http://schemas.openxmlformats.org/drawingml/2006/picture">
-                <pic:pic>
-                  <pic:nvPicPr>
-                    <pic:cNvPr descr="image/11.png" id="54" name="Picture"/>
-                    <pic:cNvPicPr>
-                      <a:picLocks noChangeArrowheads="1" noChangeAspect="1"/>
-                    </pic:cNvPicPr>
-                  </pic:nvPicPr>
-                  <pic:blipFill>
-                    <a:blip r:embed="rId52"/>
-                    <a:stretch>
-                      <a:fillRect/>
-                    </a:stretch>
-                  </pic:blipFill>
-                  <pic:spPr bwMode="auto">
-                    <a:xfrm>
-                      <a:off x="0" y="0"/>
-                      <a:ext cx="3733800" cy="1161789"/>
-                    </a:xfrm>
-                    <a:prstGeom prst="rect">
-                      <a:avLst/>
-                    </a:prstGeom>
-                    <a:noFill/>
-                    <a:ln w="9525">
-                      <a:noFill/>
-                      <a:headEnd/>
-                      <a:tailEnd/>
-                    </a:ln>
-                  </pic:spPr>
-                </pic:pic>
-              </a:graphicData>
-            </a:graphic>
-          </wp:inline>
-        </w:drawing>
-      </w:r>
-    </w:p>
-    <w:p>
-      <w:pPr>
-        <w:pStyle w:val="ImageCaption"/>
-      </w:pPr>
-      <w:r>
-        <w:t xml:space="preserve">Рис. 11: Отправка файлов</w:t>
-      </w:r>
-    </w:p>
-    <w:bookmarkEnd w:id="55"/>
-    <w:bookmarkStart w:id="56" w:name="выводы"/>
+        <w:t xml:space="preserve">UID пользователя root</w:t>
+      </w:r>
+    </w:p>
+    <w:p>
+      <w:pPr>
+        <w:pStyle w:val="Compact"/>
+        <w:numPr>
+          <w:ilvl w:val="0"/>
+          <w:numId w:val="1010"/>
+        </w:numPr>
+      </w:pPr>
+      <w:r>
+        <w:t xml:space="preserve">UID = 0</w:t>
+      </w:r>
+    </w:p>
+    <w:p>
+      <w:pPr>
+        <w:pStyle w:val="Compact"/>
+        <w:numPr>
+          <w:ilvl w:val="0"/>
+          <w:numId w:val="1010"/>
+        </w:numPr>
+      </w:pPr>
+      <w:r>
+        <w:t xml:space="preserve">Узнать UID любого пользователя:</w:t>
+      </w:r>
+    </w:p>
+    <w:p>
+      <w:pPr>
+        <w:pStyle w:val="Compact"/>
+        <w:numPr>
+          <w:ilvl w:val="1"/>
+          <w:numId w:val="1011"/>
+        </w:numPr>
+      </w:pPr>
+      <w:r>
+        <w:t xml:space="preserve">id -u [user]</w:t>
+      </w:r>
+    </w:p>
+    <w:p>
+      <w:pPr>
+        <w:pStyle w:val="Compact"/>
+        <w:numPr>
+          <w:ilvl w:val="1"/>
+          <w:numId w:val="1011"/>
+        </w:numPr>
+      </w:pPr>
+      <w:r>
+        <w:t xml:space="preserve">или через записи getent passwd root (первое числовое поле)</w:t>
+      </w:r>
+    </w:p>
+    <w:p>
+      <w:pPr>
+        <w:pStyle w:val="Compact"/>
+        <w:numPr>
+          <w:ilvl w:val="0"/>
+          <w:numId w:val="1012"/>
+        </w:numPr>
+      </w:pPr>
+      <w:r>
+        <w:t xml:space="preserve">Отличие</w:t>
+      </w:r>
+      <w:r>
+        <w:t xml:space="preserve"> </w:t>
+      </w:r>
+      <w:r>
+        <w:rPr>
+          <w:rStyle w:val="VerbatimChar"/>
+        </w:rPr>
+        <w:t xml:space="preserve">su</w:t>
+      </w:r>
+      <w:r>
+        <w:t xml:space="preserve"> </w:t>
+      </w:r>
+      <w:r>
+        <w:t xml:space="preserve">и</w:t>
+      </w:r>
+      <w:r>
+        <w:t xml:space="preserve"> </w:t>
+      </w:r>
+      <w:r>
+        <w:rPr>
+          <w:rStyle w:val="VerbatimChar"/>
+        </w:rPr>
+        <w:t xml:space="preserve">sudo</w:t>
+      </w:r>
+    </w:p>
+    <w:p>
+      <w:pPr>
+        <w:pStyle w:val="Compact"/>
+        <w:numPr>
+          <w:ilvl w:val="0"/>
+          <w:numId w:val="1013"/>
+        </w:numPr>
+      </w:pPr>
+      <w:r>
+        <w:t xml:space="preserve">su [user] – смена учётки на другого пользователя (чаще root), требуется его пароль.</w:t>
+      </w:r>
+    </w:p>
+    <w:p>
+      <w:pPr>
+        <w:pStyle w:val="Compact"/>
+        <w:numPr>
+          <w:ilvl w:val="0"/>
+          <w:numId w:val="1013"/>
+        </w:numPr>
+      </w:pPr>
+      <w:r>
+        <w:t xml:space="preserve">sudo [cmd] – запуск одной команды с повышенными привилегиями, проверяется пароль текущего пользователя и его право в sudoers.</w:t>
+      </w:r>
+    </w:p>
+    <w:p>
+      <w:pPr>
+        <w:pStyle w:val="Compact"/>
+        <w:numPr>
+          <w:ilvl w:val="0"/>
+          <w:numId w:val="1014"/>
+        </w:numPr>
+      </w:pPr>
+      <w:r>
+        <w:t xml:space="preserve">Файл конфигурации sudo</w:t>
+      </w:r>
+    </w:p>
+    <w:p>
+      <w:pPr>
+        <w:pStyle w:val="Compact"/>
+        <w:numPr>
+          <w:ilvl w:val="0"/>
+          <w:numId w:val="1015"/>
+        </w:numPr>
+      </w:pPr>
+      <w:r>
+        <w:t xml:space="preserve">Основной: /etc/sudoers</w:t>
+      </w:r>
+    </w:p>
+    <w:p>
+      <w:pPr>
+        <w:pStyle w:val="Compact"/>
+        <w:numPr>
+          <w:ilvl w:val="0"/>
+          <w:numId w:val="1015"/>
+        </w:numPr>
+      </w:pPr>
+      <w:r>
+        <w:t xml:space="preserve">Дополнительно – каталоги /etc/sudoers.d/ с дополнительными фрагментами.</w:t>
+      </w:r>
+    </w:p>
+    <w:p>
+      <w:pPr>
+        <w:pStyle w:val="Compact"/>
+        <w:numPr>
+          <w:ilvl w:val="0"/>
+          <w:numId w:val="1016"/>
+        </w:numPr>
+      </w:pPr>
+      <w:r>
+        <w:t xml:space="preserve">Безопасное изменение /etc/sudoers</w:t>
+      </w:r>
+    </w:p>
+    <w:p>
+      <w:pPr>
+        <w:pStyle w:val="Compact"/>
+        <w:numPr>
+          <w:ilvl w:val="0"/>
+          <w:numId w:val="1017"/>
+        </w:numPr>
+      </w:pPr>
+      <w:r>
+        <w:t xml:space="preserve">Использовать visudo (блокировка файла + синтаксическая проверка).</w:t>
+      </w:r>
+    </w:p>
+    <w:p>
+      <w:pPr>
+        <w:pStyle w:val="Compact"/>
+        <w:numPr>
+          <w:ilvl w:val="0"/>
+          <w:numId w:val="1018"/>
+        </w:numPr>
+      </w:pPr>
+      <w:r>
+        <w:t xml:space="preserve">Группа для полного доступа через sudo</w:t>
+      </w:r>
+    </w:p>
+    <w:p>
+      <w:pPr>
+        <w:pStyle w:val="Compact"/>
+        <w:numPr>
+          <w:ilvl w:val="0"/>
+          <w:numId w:val="1019"/>
+        </w:numPr>
+      </w:pPr>
+      <w:r>
+        <w:t xml:space="preserve">Пользователь должен состоять в группе wheel (в RHEL/Rocky Linux).</w:t>
+      </w:r>
+    </w:p>
+    <w:p>
+      <w:pPr>
+        <w:pStyle w:val="Compact"/>
+        <w:numPr>
+          <w:ilvl w:val="0"/>
+          <w:numId w:val="1020"/>
+        </w:numPr>
+      </w:pPr>
+      <w:r>
+        <w:t xml:space="preserve">Шаблоны при создании учёток</w:t>
+      </w:r>
+    </w:p>
+    <w:p>
+      <w:pPr>
+        <w:pStyle w:val="Compact"/>
+        <w:numPr>
+          <w:ilvl w:val="0"/>
+          <w:numId w:val="1021"/>
+        </w:numPr>
+      </w:pPr>
+      <w:r>
+        <w:t xml:space="preserve">/etc/login.defs (парольная политика: PASS_MAX_DAYS, UID_MIN, и т. п.)</w:t>
+      </w:r>
+    </w:p>
+    <w:p>
+      <w:pPr>
+        <w:pStyle w:val="Compact"/>
+        <w:numPr>
+          <w:ilvl w:val="0"/>
+          <w:numId w:val="1021"/>
+        </w:numPr>
+      </w:pPr>
+      <w:r>
+        <w:t xml:space="preserve">/etc/default/useradd (по умолчанию GID, HOME, shell)</w:t>
+      </w:r>
+    </w:p>
+    <w:p>
+      <w:pPr>
+        <w:pStyle w:val="Compact"/>
+        <w:numPr>
+          <w:ilvl w:val="0"/>
+          <w:numId w:val="1021"/>
+        </w:numPr>
+      </w:pPr>
+      <w:r>
+        <w:t xml:space="preserve">/etc/skel/ (файлы skeleton-каталога, копируемые в новый HOME)</w:t>
+      </w:r>
+    </w:p>
+    <w:p>
+      <w:pPr>
+        <w:pStyle w:val="Compact"/>
+        <w:numPr>
+          <w:ilvl w:val="0"/>
+          <w:numId w:val="1022"/>
+        </w:numPr>
+      </w:pPr>
+      <w:r>
+        <w:t xml:space="preserve">Хранение данных о группах</w:t>
+      </w:r>
+    </w:p>
+    <w:p>
+      <w:pPr>
+        <w:numPr>
+          <w:ilvl w:val="0"/>
+          <w:numId w:val="1023"/>
+        </w:numPr>
+      </w:pPr>
+      <w:r>
+        <w:t xml:space="preserve">Первичная группа – поле GID в записи /etc/passwd</w:t>
+      </w:r>
+    </w:p>
+    <w:p>
+      <w:pPr>
+        <w:numPr>
+          <w:ilvl w:val="0"/>
+          <w:numId w:val="1023"/>
+        </w:numPr>
+      </w:pPr>
+      <w:r>
+        <w:t xml:space="preserve">Дополнительные группы – /etc/group</w:t>
+      </w:r>
+    </w:p>
+    <w:p>
+      <w:pPr>
+        <w:numPr>
+          <w:ilvl w:val="0"/>
+          <w:numId w:val="1000"/>
+        </w:numPr>
+      </w:pPr>
+      <w:r>
+        <w:t xml:space="preserve">Пример для пользователя alice:</w:t>
+      </w:r>
+    </w:p>
+    <w:p>
+      <w:pPr>
+        <w:numPr>
+          <w:ilvl w:val="1"/>
+          <w:numId w:val="1024"/>
+        </w:numPr>
+      </w:pPr>
+      <w:r>
+        <w:t xml:space="preserve">/etc/passwd:</w:t>
+      </w:r>
+    </w:p>
+    <w:p>
+      <w:pPr>
+        <w:numPr>
+          <w:ilvl w:val="1"/>
+          <w:numId w:val="1000"/>
+        </w:numPr>
+      </w:pPr>
+      <w:r>
+        <w:t xml:space="preserve">→ GID=1001</w:t>
+      </w:r>
+    </w:p>
+    <w:p>
+      <w:pPr>
+        <w:numPr>
+          <w:ilvl w:val="1"/>
+          <w:numId w:val="1024"/>
+        </w:numPr>
+      </w:pPr>
+      <w:r>
+        <w:t xml:space="preserve">/etc/group:</w:t>
+      </w:r>
+    </w:p>
+    <w:p>
+      <w:pPr>
+        <w:numPr>
+          <w:ilvl w:val="1"/>
+          <w:numId w:val="1000"/>
+        </w:numPr>
+      </w:pPr>
+      <w:r>
+        <w:t xml:space="preserve">→ alice входит в группу developers (GID=1001) как дополнительная.</w:t>
+      </w:r>
+    </w:p>
+    <w:p>
+      <w:pPr>
+        <w:pStyle w:val="Compact"/>
+        <w:numPr>
+          <w:ilvl w:val="0"/>
+          <w:numId w:val="1025"/>
+        </w:numPr>
+      </w:pPr>
+      <w:r>
+        <w:t xml:space="preserve">Команды для изменения параметров пароля</w:t>
+      </w:r>
+    </w:p>
+    <w:p>
+      <w:pPr>
+        <w:pStyle w:val="Compact"/>
+        <w:numPr>
+          <w:ilvl w:val="0"/>
+          <w:numId w:val="1026"/>
+        </w:numPr>
+      </w:pPr>
+      <w:r>
+        <w:t xml:space="preserve">passwd – смена пароля, passwd -x N user (максимальный срок)</w:t>
+      </w:r>
+    </w:p>
+    <w:p>
+      <w:pPr>
+        <w:pStyle w:val="Compact"/>
+        <w:numPr>
+          <w:ilvl w:val="0"/>
+          <w:numId w:val="1026"/>
+        </w:numPr>
+      </w:pPr>
+      <w:r>
+        <w:t xml:space="preserve">chage – детально задаёт сроки: chage -l user, chage -M 90 user и т. д.</w:t>
+      </w:r>
+    </w:p>
+    <w:p>
+      <w:pPr>
+        <w:pStyle w:val="Compact"/>
+        <w:numPr>
+          <w:ilvl w:val="0"/>
+          <w:numId w:val="1026"/>
+        </w:numPr>
+      </w:pPr>
+      <w:r>
+        <w:t xml:space="preserve">usermod -e YYYY-MM-DD user – срок действия учётки</w:t>
+      </w:r>
+    </w:p>
+    <w:p>
+      <w:pPr>
+        <w:pStyle w:val="Compact"/>
+        <w:numPr>
+          <w:ilvl w:val="0"/>
+          <w:numId w:val="1027"/>
+        </w:numPr>
+      </w:pPr>
+      <w:r>
+        <w:t xml:space="preserve">Прямое изменение /etc/group</w:t>
+      </w:r>
+    </w:p>
+    <w:p>
+      <w:pPr>
+        <w:pStyle w:val="Compact"/>
+        <w:numPr>
+          <w:ilvl w:val="0"/>
+          <w:numId w:val="1028"/>
+        </w:numPr>
+      </w:pPr>
+      <w:r>
+        <w:t xml:space="preserve">Использовать vigr (или</w:t>
+      </w:r>
+      <w:r>
+        <w:t xml:space="preserve"> </w:t>
+      </w:r>
+      <w:r>
+        <w:rPr>
+          <w:rStyle w:val="VerbatimChar"/>
+        </w:rPr>
+        <w:t xml:space="preserve">vipw -g</w:t>
+      </w:r>
+      <w:r>
+        <w:t xml:space="preserve">) – обеспечивает блокировку файла и проверку синтаксиса, предотвращая повреждение.</w:t>
+      </w:r>
+    </w:p>
+    <w:bookmarkEnd w:id="40"/>
+    <w:bookmarkStart w:id="41" w:name="вывод"/>
     <w:p>
       <w:pPr>
         <w:pStyle w:val="Heading1"/>
@@ -949,7 +1223,7 @@
         <w:tab/>
       </w:r>
       <w:r>
-        <w:t xml:space="preserve">Выводы</w:t>
+        <w:t xml:space="preserve">Вывод</w:t>
       </w:r>
     </w:p>
     <w:p>
@@ -957,164 +1231,16 @@
         <w:pStyle w:val="FirstParagraph"/>
       </w:pPr>
       <w:r>
-        <w:t xml:space="preserve">Мы изучили идеологию и применение средств контроля версий и освоили умения по работе с git.</w:t>
-      </w:r>
-    </w:p>
-    <w:bookmarkEnd w:id="56"/>
-    <w:bookmarkStart w:id="57" w:name="ответы-на-контрольные-вопросы"/>
-    <w:p>
-      <w:pPr>
-        <w:pStyle w:val="Heading1"/>
-      </w:pPr>
-      <w:r>
-        <w:rPr>
-          <w:rStyle w:val="SectionNumber"/>
-        </w:rPr>
-        <w:t xml:space="preserve">5</w:t>
-      </w:r>
-      <w:r>
-        <w:tab/>
-      </w:r>
-      <w:r>
-        <w:t xml:space="preserve">Ответы на контрольные вопросы</w:t>
-      </w:r>
-    </w:p>
-    <w:p>
-      <w:pPr>
-        <w:pStyle w:val="Compact"/>
-        <w:numPr>
-          <w:ilvl w:val="0"/>
-          <w:numId w:val="1010"/>
-        </w:numPr>
-      </w:pPr>
-      <w:r>
-        <w:t xml:space="preserve">Системы контроля версий для отслеживанияизменений в файлах, совместной работы и возврата к предыдущим версиям.</w:t>
-      </w:r>
-    </w:p>
-    <w:p>
-      <w:pPr>
-        <w:pStyle w:val="Compact"/>
-        <w:numPr>
-          <w:ilvl w:val="0"/>
-          <w:numId w:val="1010"/>
-        </w:numPr>
-      </w:pPr>
-      <w:r>
-        <w:t xml:space="preserve">Хранилище - место для хранения файлов. Commit - запись изменений в хранилище. История - последовательность всех коммитов. Рабочая копия - локальна копия файлов для редактирования.</w:t>
-      </w:r>
-    </w:p>
-    <w:p>
-      <w:pPr>
-        <w:pStyle w:val="Compact"/>
-        <w:numPr>
-          <w:ilvl w:val="0"/>
-          <w:numId w:val="1010"/>
-        </w:numPr>
-      </w:pPr>
-      <w:r>
-        <w:t xml:space="preserve">Централизованные - один центральный сервер и все работают с ним. Децентрализованные - у каждого полная копия хранилища.</w:t>
-      </w:r>
-    </w:p>
-    <w:p>
-      <w:pPr>
-        <w:pStyle w:val="Compact"/>
-        <w:numPr>
-          <w:ilvl w:val="0"/>
-          <w:numId w:val="1010"/>
-        </w:numPr>
-      </w:pPr>
-      <w:r>
-        <w:t xml:space="preserve">Добавление файлов в рабочую область. Commit изменений.</w:t>
-      </w:r>
-    </w:p>
-    <w:p>
-      <w:pPr>
-        <w:pStyle w:val="Compact"/>
-        <w:numPr>
-          <w:ilvl w:val="0"/>
-          <w:numId w:val="1010"/>
-        </w:numPr>
-      </w:pPr>
-      <w:r>
-        <w:t xml:space="preserve">Клонирование хранилища, внесение изменений, commit, push.</w:t>
-      </w:r>
-    </w:p>
-    <w:p>
-      <w:pPr>
-        <w:pStyle w:val="Compact"/>
-        <w:numPr>
-          <w:ilvl w:val="0"/>
-          <w:numId w:val="1010"/>
-        </w:numPr>
-      </w:pPr>
-      <w:r>
-        <w:t xml:space="preserve">Управление версиями, совместная работа, отслеживание изменений.</w:t>
-      </w:r>
-    </w:p>
-    <w:p>
-      <w:pPr>
-        <w:pStyle w:val="Compact"/>
-        <w:numPr>
-          <w:ilvl w:val="0"/>
-          <w:numId w:val="1010"/>
-        </w:numPr>
-      </w:pPr>
-      <w:r>
-        <w:t xml:space="preserve">git add - добавление в индекс, git push - отправка изменений, git pull - получение изменений, get clone - клонирование.</w:t>
-      </w:r>
-    </w:p>
-    <w:p>
-      <w:pPr>
-        <w:pStyle w:val="Compact"/>
-        <w:numPr>
-          <w:ilvl w:val="0"/>
-          <w:numId w:val="1010"/>
-        </w:numPr>
-      </w:pPr>
-      <w:r>
-        <w:t xml:space="preserve">Локальный: git init, git add ., git commit -m</w:t>
-      </w:r>
-      <w:r>
-        <w:t xml:space="preserve"> </w:t>
-      </w:r>
-      <w:r>
-        <w:t xml:space="preserve">“</w:t>
-      </w:r>
-      <w:r>
-        <w:t xml:space="preserve">Initial commit</w:t>
-      </w:r>
-      <w:r>
-        <w:t xml:space="preserve">”</w:t>
-      </w:r>
-      <w:r>
-        <w:t xml:space="preserve">. Удаленный: git clone …, git push.</w:t>
-      </w:r>
-    </w:p>
-    <w:p>
-      <w:pPr>
-        <w:pStyle w:val="Compact"/>
-        <w:numPr>
-          <w:ilvl w:val="0"/>
-          <w:numId w:val="1010"/>
-        </w:numPr>
-      </w:pPr>
-      <w:r>
-        <w:t xml:space="preserve">Независимые линии разработки. Нужны для эксперементов, разработки новых функций без влияния на основную копию.</w:t>
-      </w:r>
-    </w:p>
-    <w:p>
-      <w:pPr>
-        <w:pStyle w:val="Compact"/>
-        <w:numPr>
-          <w:ilvl w:val="0"/>
-          <w:numId w:val="1010"/>
-        </w:numPr>
-      </w:pPr>
-      <w:r>
-        <w:t xml:space="preserve">Исключение файлов из отслеживания. Нужно для временнных файлов, логов, конфиденциальной информации.</w:t>
-      </w:r>
-    </w:p>
-    <w:bookmarkEnd w:id="57"/>
+        <w:t xml:space="preserve">Мы получили представление о работе с учётными записями пользователей и группами</w:t>
+      </w:r>
+      <w:r>
+        <w:t xml:space="preserve"> </w:t>
+      </w:r>
+      <w:r>
+        <w:t xml:space="preserve">пользователей в операционной системе типа Linux.</w:t>
+      </w:r>
+    </w:p>
+    <w:bookmarkEnd w:id="41"/>
     <w:sectPr/>
   </w:body>
 </w:document>
@@ -1731,6 +1857,82 @@
       </w:pPr>
     </w:lvl>
   </w:abstractNum>
+  <w:abstractNum w:abstractNumId="991">
+    <w:nsid w:val="0000A991"/>
+    <w:multiLevelType w:val="multilevel"/>
+    <w:lvl w:ilvl="0">
+      <w:numFmt w:val="bullet"/>
+      <w:lvlText w:val="•"/>
+      <w:lvlJc w:val="left"/>
+      <w:pPr>
+        <w:ind w:left="720" w:hanging="480"/>
+      </w:pPr>
+    </w:lvl>
+    <w:lvl w:ilvl="1">
+      <w:numFmt w:val="bullet"/>
+      <w:lvlText w:val="–"/>
+      <w:lvlJc w:val="left"/>
+      <w:pPr>
+        <w:ind w:left="1440" w:hanging="480"/>
+      </w:pPr>
+    </w:lvl>
+    <w:lvl w:ilvl="2">
+      <w:numFmt w:val="bullet"/>
+      <w:lvlText w:val="•"/>
+      <w:lvlJc w:val="left"/>
+      <w:pPr>
+        <w:ind w:left="2160" w:hanging="480"/>
+      </w:pPr>
+    </w:lvl>
+    <w:lvl w:ilvl="3">
+      <w:numFmt w:val="bullet"/>
+      <w:lvlText w:val="–"/>
+      <w:lvlJc w:val="left"/>
+      <w:pPr>
+        <w:ind w:left="2880" w:hanging="480"/>
+      </w:pPr>
+    </w:lvl>
+    <w:lvl w:ilvl="4">
+      <w:numFmt w:val="bullet"/>
+      <w:lvlText w:val="•"/>
+      <w:lvlJc w:val="left"/>
+      <w:pPr>
+        <w:ind w:left="3600" w:hanging="480"/>
+      </w:pPr>
+    </w:lvl>
+    <w:lvl w:ilvl="5">
+      <w:numFmt w:val="bullet"/>
+      <w:lvlText w:val="–"/>
+      <w:lvlJc w:val="left"/>
+      <w:pPr>
+        <w:ind w:left="4320" w:hanging="480"/>
+      </w:pPr>
+    </w:lvl>
+    <w:lvl w:ilvl="6">
+      <w:numFmt w:val="bullet"/>
+      <w:lvlText w:val="•"/>
+      <w:lvlJc w:val="left"/>
+      <w:pPr>
+        <w:ind w:left="5040" w:hanging="480"/>
+      </w:pPr>
+    </w:lvl>
+    <w:lvl w:ilvl="7">
+      <w:numFmt w:val="bullet"/>
+      <w:lvlText w:val="–"/>
+      <w:lvlJc w:val="left"/>
+      <w:pPr>
+        <w:ind w:left="5760" w:hanging="480"/>
+      </w:pPr>
+    </w:lvl>
+    <w:lvl w:ilvl="8">
+      <w:numFmt w:val="bullet"/>
+      <w:lvlText w:val="•"/>
+      <w:lvlJc w:val="left"/>
+      <w:pPr>
+        <w:ind w:left="6480" w:hanging="480"/>
+      </w:pPr>
+    </w:lvl>
+  </w:abstractNum>
   <w:abstractNum w:abstractNumId="99417">
     <w:nsid w:val="00A99417"/>
     <w:multiLevelType w:val="multilevel"/>
@@ -1978,6 +2180,91 @@
     </w:lvl>
     <w:lvl w:ilvl="8">
       <w:start w:val="9"/>
+      <w:numFmt w:val="decimal"/>
+      <w:lvlText w:val="%9."/>
+      <w:lvlJc w:val="left"/>
+      <w:pPr>
+        <w:ind w:left="6480" w:hanging="480"/>
+      </w:pPr>
+    </w:lvl>
+  </w:abstractNum>
+  <w:abstractNum w:abstractNumId="994110">
+    <w:nsid w:val="0A994110"/>
+    <w:multiLevelType w:val="multilevel"/>
+    <w:lvl w:ilvl="0">
+      <w:start w:val="10"/>
+      <w:numFmt w:val="decimal"/>
+      <w:lvlText w:val="%1."/>
+      <w:lvlJc w:val="left"/>
+      <w:pPr>
+        <w:ind w:left="720" w:hanging="480"/>
+      </w:pPr>
+    </w:lvl>
+    <w:lvl w:ilvl="1">
+      <w:start w:val="10"/>
+      <w:numFmt w:val="decimal"/>
+      <w:lvlText w:val="%2."/>
+      <w:lvlJc w:val="left"/>
+      <w:pPr>
+        <w:ind w:left="1440" w:hanging="480"/>
+      </w:pPr>
+    </w:lvl>
+    <w:lvl w:ilvl="2">
+      <w:start w:val="10"/>
+      <w:numFmt w:val="decimal"/>
+      <w:lvlText w:val="%3."/>
+      <w:lvlJc w:val="left"/>
+      <w:pPr>
+        <w:ind w:left="2160" w:hanging="480"/>
+      </w:pPr>
+    </w:lvl>
+    <w:lvl w:ilvl="3">
+      <w:start w:val="10"/>
+      <w:numFmt w:val="decimal"/>
+      <w:lvlText w:val="%4."/>
+      <w:lvlJc w:val="left"/>
+      <w:pPr>
+        <w:ind w:left="2880" w:hanging="480"/>
+      </w:pPr>
+    </w:lvl>
+    <w:lvl w:ilvl="4">
+      <w:start w:val="10"/>
+      <w:numFmt w:val="decimal"/>
+      <w:lvlText w:val="%5."/>
+      <w:lvlJc w:val="left"/>
+      <w:pPr>
+        <w:ind w:left="3600" w:hanging="480"/>
+      </w:pPr>
+    </w:lvl>
+    <w:lvl w:ilvl="5">
+      <w:start w:val="10"/>
+      <w:numFmt w:val="decimal"/>
+      <w:lvlText w:val="%6."/>
+      <w:lvlJc w:val="left"/>
+      <w:pPr>
+        <w:ind w:left="4320" w:hanging="480"/>
+      </w:pPr>
+    </w:lvl>
+    <w:lvl w:ilvl="6">
+      <w:start w:val="10"/>
+      <w:numFmt w:val="decimal"/>
+      <w:lvlText w:val="%7."/>
+      <w:lvlJc w:val="left"/>
+      <w:pPr>
+        <w:ind w:left="5040" w:hanging="480"/>
+      </w:pPr>
+    </w:lvl>
+    <w:lvl w:ilvl="7">
+      <w:start w:val="10"/>
+      <w:numFmt w:val="decimal"/>
+      <w:lvlText w:val="%8."/>
+      <w:lvlJc w:val="left"/>
+      <w:pPr>
+        <w:ind w:left="5760" w:hanging="480"/>
+      </w:pPr>
+    </w:lvl>
+    <w:lvl w:ilvl="8">
+      <w:start w:val="10"/>
       <w:numFmt w:val="decimal"/>
       <w:lvlText w:val="%9."/>
       <w:lvlJc w:val="left"/>
@@ -2170,6 +2457,207 @@
     </w:lvlOverride>
   </w:num>
   <w:num w:numId="1007">
+    <w:abstractNumId w:val="99411"/>
+    <w:lvlOverride w:ilvl="0">
+      <w:startOverride w:val="1"/>
+    </w:lvlOverride>
+    <w:lvlOverride w:ilvl="1">
+      <w:startOverride w:val="1"/>
+    </w:lvlOverride>
+    <w:lvlOverride w:ilvl="2">
+      <w:startOverride w:val="1"/>
+    </w:lvlOverride>
+    <w:lvlOverride w:ilvl="3">
+      <w:startOverride w:val="1"/>
+    </w:lvlOverride>
+    <w:lvlOverride w:ilvl="4">
+      <w:startOverride w:val="1"/>
+    </w:lvlOverride>
+    <w:lvlOverride w:ilvl="5">
+      <w:startOverride w:val="1"/>
+    </w:lvlOverride>
+    <w:lvlOverride w:ilvl="6">
+      <w:startOverride w:val="1"/>
+    </w:lvlOverride>
+    <w:lvlOverride w:ilvl="7">
+      <w:startOverride w:val="1"/>
+    </w:lvlOverride>
+    <w:lvlOverride w:ilvl="8">
+      <w:startOverride w:val="1"/>
+    </w:lvlOverride>
+  </w:num>
+  <w:num w:numId="1008">
+    <w:abstractNumId w:val="991"/>
+  </w:num>
+  <w:num w:numId="1009">
+    <w:abstractNumId w:val="99412"/>
+    <w:lvlOverride w:ilvl="0">
+      <w:startOverride w:val="2"/>
+    </w:lvlOverride>
+    <w:lvlOverride w:ilvl="1">
+      <w:startOverride w:val="2"/>
+    </w:lvlOverride>
+    <w:lvlOverride w:ilvl="2">
+      <w:startOverride w:val="2"/>
+    </w:lvlOverride>
+    <w:lvlOverride w:ilvl="3">
+      <w:startOverride w:val="2"/>
+    </w:lvlOverride>
+    <w:lvlOverride w:ilvl="4">
+      <w:startOverride w:val="2"/>
+    </w:lvlOverride>
+    <w:lvlOverride w:ilvl="5">
+      <w:startOverride w:val="2"/>
+    </w:lvlOverride>
+    <w:lvlOverride w:ilvl="6">
+      <w:startOverride w:val="2"/>
+    </w:lvlOverride>
+    <w:lvlOverride w:ilvl="7">
+      <w:startOverride w:val="2"/>
+    </w:lvlOverride>
+    <w:lvlOverride w:ilvl="8">
+      <w:startOverride w:val="2"/>
+    </w:lvlOverride>
+  </w:num>
+  <w:num w:numId="1010">
+    <w:abstractNumId w:val="991"/>
+  </w:num>
+  <w:num w:numId="1011">
+    <w:abstractNumId w:val="991"/>
+  </w:num>
+  <w:num w:numId="1012">
+    <w:abstractNumId w:val="99413"/>
+    <w:lvlOverride w:ilvl="0">
+      <w:startOverride w:val="3"/>
+    </w:lvlOverride>
+    <w:lvlOverride w:ilvl="1">
+      <w:startOverride w:val="3"/>
+    </w:lvlOverride>
+    <w:lvlOverride w:ilvl="2">
+      <w:startOverride w:val="3"/>
+    </w:lvlOverride>
+    <w:lvlOverride w:ilvl="3">
+      <w:startOverride w:val="3"/>
+    </w:lvlOverride>
+    <w:lvlOverride w:ilvl="4">
+      <w:startOverride w:val="3"/>
+    </w:lvlOverride>
+    <w:lvlOverride w:ilvl="5">
+      <w:startOverride w:val="3"/>
+    </w:lvlOverride>
+    <w:lvlOverride w:ilvl="6">
+      <w:startOverride w:val="3"/>
+    </w:lvlOverride>
+    <w:lvlOverride w:ilvl="7">
+      <w:startOverride w:val="3"/>
+    </w:lvlOverride>
+    <w:lvlOverride w:ilvl="8">
+      <w:startOverride w:val="3"/>
+    </w:lvlOverride>
+  </w:num>
+  <w:num w:numId="1013">
+    <w:abstractNumId w:val="991"/>
+  </w:num>
+  <w:num w:numId="1014">
+    <w:abstractNumId w:val="99414"/>
+    <w:lvlOverride w:ilvl="0">
+      <w:startOverride w:val="4"/>
+    </w:lvlOverride>
+    <w:lvlOverride w:ilvl="1">
+      <w:startOverride w:val="4"/>
+    </w:lvlOverride>
+    <w:lvlOverride w:ilvl="2">
+      <w:startOverride w:val="4"/>
+    </w:lvlOverride>
+    <w:lvlOverride w:ilvl="3">
+      <w:startOverride w:val="4"/>
+    </w:lvlOverride>
+    <w:lvlOverride w:ilvl="4">
+      <w:startOverride w:val="4"/>
+    </w:lvlOverride>
+    <w:lvlOverride w:ilvl="5">
+      <w:startOverride w:val="4"/>
+    </w:lvlOverride>
+    <w:lvlOverride w:ilvl="6">
+      <w:startOverride w:val="4"/>
+    </w:lvlOverride>
+    <w:lvlOverride w:ilvl="7">
+      <w:startOverride w:val="4"/>
+    </w:lvlOverride>
+    <w:lvlOverride w:ilvl="8">
+      <w:startOverride w:val="4"/>
+    </w:lvlOverride>
+  </w:num>
+  <w:num w:numId="1015">
+    <w:abstractNumId w:val="991"/>
+  </w:num>
+  <w:num w:numId="1016">
+    <w:abstractNumId w:val="99415"/>
+    <w:lvlOverride w:ilvl="0">
+      <w:startOverride w:val="5"/>
+    </w:lvlOverride>
+    <w:lvlOverride w:ilvl="1">
+      <w:startOverride w:val="5"/>
+    </w:lvlOverride>
+    <w:lvlOverride w:ilvl="2">
+      <w:startOverride w:val="5"/>
+    </w:lvlOverride>
+    <w:lvlOverride w:ilvl="3">
+      <w:startOverride w:val="5"/>
+    </w:lvlOverride>
+    <w:lvlOverride w:ilvl="4">
+      <w:startOverride w:val="5"/>
+    </w:lvlOverride>
+    <w:lvlOverride w:ilvl="5">
+      <w:startOverride w:val="5"/>
+    </w:lvlOverride>
+    <w:lvlOverride w:ilvl="6">
+      <w:startOverride w:val="5"/>
+    </w:lvlOverride>
+    <w:lvlOverride w:ilvl="7">
+      <w:startOverride w:val="5"/>
+    </w:lvlOverride>
+    <w:lvlOverride w:ilvl="8">
+      <w:startOverride w:val="5"/>
+    </w:lvlOverride>
+  </w:num>
+  <w:num w:numId="1017">
+    <w:abstractNumId w:val="991"/>
+  </w:num>
+  <w:num w:numId="1018">
+    <w:abstractNumId w:val="99416"/>
+    <w:lvlOverride w:ilvl="0">
+      <w:startOverride w:val="6"/>
+    </w:lvlOverride>
+    <w:lvlOverride w:ilvl="1">
+      <w:startOverride w:val="6"/>
+    </w:lvlOverride>
+    <w:lvlOverride w:ilvl="2">
+      <w:startOverride w:val="6"/>
+    </w:lvlOverride>
+    <w:lvlOverride w:ilvl="3">
+      <w:startOverride w:val="6"/>
+    </w:lvlOverride>
+    <w:lvlOverride w:ilvl="4">
+      <w:startOverride w:val="6"/>
+    </w:lvlOverride>
+    <w:lvlOverride w:ilvl="5">
+      <w:startOverride w:val="6"/>
+    </w:lvlOverride>
+    <w:lvlOverride w:ilvl="6">
+      <w:startOverride w:val="6"/>
+    </w:lvlOverride>
+    <w:lvlOverride w:ilvl="7">
+      <w:startOverride w:val="6"/>
+    </w:lvlOverride>
+    <w:lvlOverride w:ilvl="8">
+      <w:startOverride w:val="6"/>
+    </w:lvlOverride>
+  </w:num>
+  <w:num w:numId="1019">
+    <w:abstractNumId w:val="991"/>
+  </w:num>
+  <w:num w:numId="1020">
     <w:abstractNumId w:val="99417"/>
     <w:lvlOverride w:ilvl="0">
       <w:startOverride w:val="7"/>
@@ -2199,7 +2687,10 @@
       <w:startOverride w:val="7"/>
     </w:lvlOverride>
   </w:num>
-  <w:num w:numId="1008">
+  <w:num w:numId="1021">
+    <w:abstractNumId w:val="991"/>
+  </w:num>
+  <w:num w:numId="1022">
     <w:abstractNumId w:val="99418"/>
     <w:lvlOverride w:ilvl="0">
       <w:startOverride w:val="8"/>
@@ -2229,7 +2720,13 @@
       <w:startOverride w:val="8"/>
     </w:lvlOverride>
   </w:num>
-  <w:num w:numId="1009">
+  <w:num w:numId="1023">
+    <w:abstractNumId w:val="991"/>
+  </w:num>
+  <w:num w:numId="1024">
+    <w:abstractNumId w:val="991"/>
+  </w:num>
+  <w:num w:numId="1025">
     <w:abstractNumId w:val="99419"/>
     <w:lvlOverride w:ilvl="0">
       <w:startOverride w:val="9"/>
@@ -2259,35 +2756,41 @@
       <w:startOverride w:val="9"/>
     </w:lvlOverride>
   </w:num>
-  <w:num w:numId="1010">
-    <w:abstractNumId w:val="99411"/>
+  <w:num w:numId="1026">
+    <w:abstractNumId w:val="991"/>
+  </w:num>
+  <w:num w:numId="1027">
+    <w:abstractNumId w:val="994110"/>
     <w:lvlOverride w:ilvl="0">
-      <w:startOverride w:val="1"/>
+      <w:startOverride w:val="10"/>
     </w:lvlOverride>
     <w:lvlOverride w:ilvl="1">
-      <w:startOverride w:val="1"/>
+      <w:startOverride w:val="10"/>
     </w:lvlOverride>
     <w:lvlOverride w:ilvl="2">
-      <w:startOverride w:val="1"/>
+      <w:startOverride w:val="10"/>
     </w:lvlOverride>
     <w:lvlOverride w:ilvl="3">
-      <w:startOverride w:val="1"/>
+      <w:startOverride w:val="10"/>
     </w:lvlOverride>
     <w:lvlOverride w:ilvl="4">
-      <w:startOverride w:val="1"/>
+      <w:startOverride w:val="10"/>
     </w:lvlOverride>
     <w:lvlOverride w:ilvl="5">
-      <w:startOverride w:val="1"/>
+      <w:startOverride w:val="10"/>
     </w:lvlOverride>
     <w:lvlOverride w:ilvl="6">
-      <w:startOverride w:val="1"/>
+      <w:startOverride w:val="10"/>
     </w:lvlOverride>
     <w:lvlOverride w:ilvl="7">
-      <w:startOverride w:val="1"/>
+      <w:startOverride w:val="10"/>
     </w:lvlOverride>
     <w:lvlOverride w:ilvl="8">
-      <w:startOverride w:val="1"/>
-    </w:lvlOverride>
+      <w:startOverride w:val="10"/>
+    </w:lvlOverride>
+  </w:num>
+  <w:num w:numId="1028">
+    <w:abstractNumId w:val="991"/>
   </w:num>
 </w:numbering>
 </file>

</xml_diff>